<commit_message>
fix(catalog): cast :now parameter to SQL Server time in upcoming queries (BE-09)
- Cast :now parameter to time in ClassSessionRepository.countUpcomingByClassIds and BookingRepository.countUpcomingByClass.
- Resolve SQLServerException incompatible time and datetime data types caused by mssql-jdbc sendTimeAsDatetime default.
- Correct repository method references in CHANGELOG and AI audit log.
</commit_message>
<xml_diff>
--- a/docs/audit/BE-09_AI_Audit_Log.docx
+++ b/docs/audit/BE-09_AI_Audit_Log.docx
@@ -370,7 +370,7 @@
         <w:spacing w:before="0" w:after="80" w:line="276" w:lineRule="auto"/>
       </w:pPr>
       <w:r>
-        <w:t>Task BE-09 delivers the core backend APIs supporting screens F2-01 (Class Management) and F2-02 (Create / Edit Class) for the Manager workspace in Flow 2. The implementation enforces role-based security, foreign key and coach qualification verification against coach_sport, automated class code formatting via seq_class_code and CodeFormatter (CL-%04d format), conflict detection preventing class deactivation when future booked sessions exist, query optimizations using @EntityGraph to eliminate N+1 fetches without unsafe criteria casts, shared SQL Server LIKE wildcard and bracket escaping, and audit event logging (CLASS_CREATED, CLASS_UPDATED, CLASS_STATUS_CHANGED).</w:t>
+        <w:t>Task BE-09 delivers the core backend APIs supporting screens F2-01 (Class Management) and F2-02 (Create / Edit Class) for the Manager workspace in Flow 2. The implementation enforces role-based security, foreign key and coach qualification verification against coach_sport, automated class code formatting via seq_class_code and CodeFormatter (CL-%04d format), conflict detection preventing class deactivation when future booked sessions exist, query optimizations using @EntityGraph to eliminate N+1 fetches without unsafe criteria casts, shared SQL Server LIKE wildcard and bracket escaping, explicit time casting for LocalTime parameters in upcoming queries, and audit event logging (CLASS_CREATED, CLASS_UPDATED, CLASS_STATUS_CHANGED).</w:t>
       </w:r>
     </w:p>
     <w:p>
@@ -1285,6 +1285,22 @@
           <w:b/>
           <w:color w:val="1B365D"/>
         </w:rPr>
+        <w:t xml:space="preserve">SQL Server TIME Parameter Casting: </w:t>
+      </w:r>
+      <w:r>
+        <w:t>In ClassSessionRepository.countUpcomingByClassIds and BookingRepository.countUpcomingByClass, LocalTime parameter :now is cast explicitly to SQL Server time (s.startTime &gt; cast(:now as time)). This prevents SQLServerException: The data types time and datetime are incompatible in the greater than operator because mssql-jdbc defaults sendTimeAsDatetime=true and transmits LocalTime as datetime.</w:t>
+      </w:r>
+    </w:p>
+    <w:p>
+      <w:pPr>
+        <w:pStyle w:val="ListBullet"/>
+        <w:spacing w:before="0" w:after="40" w:line="276" w:lineRule="auto"/>
+      </w:pPr>
+      <w:r>
+        <w:rPr>
+          <w:b/>
+          <w:color w:val="1B365D"/>
+        </w:rPr>
         <w:t xml:space="preserve">Query Specification &amp; @EntityGraph: </w:t>
       </w:r>
       <w:r>
@@ -1752,7 +1768,7 @@
               <w:rPr>
                 <w:sz w:val="17"/>
               </w:rPr>
-              <w:t>Documentation: Added entry for BE-09 with follow-ups and verification note</w:t>
+              <w:t>Documentation: Added entry for BE-09 with follow-ups, repository details, and TIME cast note</w:t>
             </w:r>
           </w:p>
         </w:tc>
@@ -1898,7 +1914,7 @@
               <w:rPr>
                 <w:sz w:val="17"/>
               </w:rPr>
-              <w:t>Repository: Added countUpcomingByClass query</w:t>
+              <w:t>Repository: Added countUpcomingByClass query with cast(:now as time)</w:t>
             </w:r>
           </w:p>
         </w:tc>
@@ -1971,7 +1987,7 @@
               <w:rPr>
                 <w:sz w:val="17"/>
               </w:rPr>
-              <w:t>Repository: Added countUpcomingByClass query</w:t>
+              <w:t>Repository: Added countUpcomingByClassIds query with cast(:now as time)</w:t>
             </w:r>
           </w:p>
         </w:tc>
@@ -2044,7 +2060,7 @@
               <w:rPr>
                 <w:sz w:val="17"/>
               </w:rPr>
-              <w:t>Repository: Overridden findAll with @EntityGraph and seq_class_code native query</w:t>
+              <w:t>Repository: Added findWithDetailsById and overrode findAll with @EntityGraph</w:t>
             </w:r>
           </w:p>
         </w:tc>
@@ -2190,7 +2206,7 @@
               <w:rPr>
                 <w:sz w:val="17"/>
               </w:rPr>
-              <w:t>Repository: Added findWithAccountById</w:t>
+              <w:t>Repository: Added findWithAccountById, findActiveCoaches, and findActiveCoachesBySport</w:t>
             </w:r>
           </w:p>
         </w:tc>
@@ -2263,7 +2279,7 @@
               <w:rPr>
                 <w:sz w:val="17"/>
               </w:rPr>
-              <w:t>Repository: Added existsById</w:t>
+              <w:t>Repository: Added findByIdCoachIdIn</w:t>
             </w:r>
           </w:p>
         </w:tc>

</xml_diff>